<commit_message>
"Updated subproject commit hash to include 'dirty' suffix"
</commit_message>
<xml_diff>
--- a/Book Circle/User Stories/Book-35 Notifications.docx
+++ b/Book Circle/User Stories/Book-35 Notifications.docx
@@ -74,13 +74,8 @@
         </w:numPr>
       </w:pPr>
       <w:r>
-        <w:t xml:space="preserve">Request Sent to </w:t>
-      </w:r>
-      <w:proofErr w:type="spellStart"/>
-      <w:r>
-        <w:t>UserId</w:t>
-      </w:r>
-      <w:proofErr w:type="spellEnd"/>
+        <w:t>User deleted successfully</w:t>
+      </w:r>
     </w:p>
     <w:p>
       <w:pPr>
@@ -91,7 +86,12 @@
         </w:numPr>
       </w:pPr>
       <w:r>
-        <w:t>Book Exchange Successful</w:t>
+        <w:t>Club deleted Successfully</w:t>
+      </w:r>
+    </w:p>
+    <w:p>
+      <w:r>
+        <w:t>Notifications received by Club Admin</w:t>
       </w:r>
     </w:p>
     <w:p>
@@ -103,7 +103,7 @@
         </w:numPr>
       </w:pPr>
       <w:r>
-        <w:t>Book Not Found</w:t>
+        <w:t>User Added Successfully</w:t>
       </w:r>
     </w:p>
     <w:p>
@@ -115,7 +115,7 @@
         </w:numPr>
       </w:pPr>
       <w:r>
-        <w:t>User deleted successfully</w:t>
+        <w:t>New Book added Successfully</w:t>
       </w:r>
     </w:p>
     <w:p>
@@ -127,12 +127,43 @@
         </w:numPr>
       </w:pPr>
       <w:r>
-        <w:t>Club deleted Successfully</w:t>
-      </w:r>
-    </w:p>
-    <w:p>
-      <w:r>
-        <w:t>Notifications received by Club Admin</w:t>
+        <w:t>Review added on [Book Id]</w:t>
+      </w:r>
+    </w:p>
+    <w:p>
+      <w:pPr>
+        <w:pStyle w:val="ListParagraph"/>
+        <w:numPr>
+          <w:ilvl w:val="1"/>
+          <w:numId w:val="1"/>
+        </w:numPr>
+      </w:pPr>
+      <w:r>
+        <w:t>View</w:t>
+      </w:r>
+    </w:p>
+    <w:p>
+      <w:pPr>
+        <w:pStyle w:val="ListParagraph"/>
+        <w:numPr>
+          <w:ilvl w:val="2"/>
+          <w:numId w:val="1"/>
+        </w:numPr>
+      </w:pPr>
+      <w:r>
+        <w:t>If valid, Review Accepted</w:t>
+      </w:r>
+    </w:p>
+    <w:p>
+      <w:pPr>
+        <w:pStyle w:val="ListParagraph"/>
+        <w:numPr>
+          <w:ilvl w:val="2"/>
+          <w:numId w:val="1"/>
+        </w:numPr>
+      </w:pPr>
+      <w:r>
+        <w:t>If invalid, Ask for re-review</w:t>
       </w:r>
     </w:p>
     <w:p>
@@ -144,7 +175,12 @@
         </w:numPr>
       </w:pPr>
       <w:r>
-        <w:t>User Added Successfully</w:t>
+        <w:t>User deleted Successfully</w:t>
+      </w:r>
+    </w:p>
+    <w:p>
+      <w:r>
+        <w:t>Notifications Received by Club Members</w:t>
       </w:r>
     </w:p>
     <w:p>
@@ -156,31 +192,15 @@
         </w:numPr>
       </w:pPr>
       <w:r>
-        <w:t>New Book added Successfully</w:t>
-      </w:r>
-    </w:p>
-    <w:p>
-      <w:pPr>
-        <w:pStyle w:val="ListParagraph"/>
-        <w:numPr>
-          <w:ilvl w:val="0"/>
-          <w:numId w:val="1"/>
-        </w:numPr>
-      </w:pPr>
-      <w:r>
-        <w:t>Book Exchange Successful</w:t>
-      </w:r>
-    </w:p>
-    <w:p>
-      <w:pPr>
-        <w:pStyle w:val="ListParagraph"/>
-        <w:numPr>
-          <w:ilvl w:val="0"/>
-          <w:numId w:val="1"/>
-        </w:numPr>
-      </w:pPr>
-      <w:r>
-        <w:t>Review added on [Book Id]</w:t>
+        <w:t>New Book Added</w:t>
+      </w:r>
+    </w:p>
+    <w:p>
+      <w:pPr>
+        <w:pStyle w:val="ListParagraph"/>
+      </w:pPr>
+      <w:r>
+        <w:t>If I am requesting for a book</w:t>
       </w:r>
     </w:p>
     <w:p>
@@ -192,84 +212,7 @@
         </w:numPr>
       </w:pPr>
       <w:r>
-        <w:t>View</w:t>
-      </w:r>
-    </w:p>
-    <w:p>
-      <w:pPr>
-        <w:pStyle w:val="ListParagraph"/>
-        <w:numPr>
-          <w:ilvl w:val="2"/>
-          <w:numId w:val="1"/>
-        </w:numPr>
-      </w:pPr>
-      <w:r>
-        <w:t>If valid, Review Accepted</w:t>
-      </w:r>
-    </w:p>
-    <w:p>
-      <w:pPr>
-        <w:pStyle w:val="ListParagraph"/>
-        <w:numPr>
-          <w:ilvl w:val="2"/>
-          <w:numId w:val="1"/>
-        </w:numPr>
-      </w:pPr>
-      <w:r>
-        <w:t>If invalid, Ask for re-review</w:t>
-      </w:r>
-    </w:p>
-    <w:p>
-      <w:pPr>
-        <w:pStyle w:val="ListParagraph"/>
-        <w:numPr>
-          <w:ilvl w:val="0"/>
-          <w:numId w:val="1"/>
-        </w:numPr>
-      </w:pPr>
-      <w:r>
-        <w:t>User deleted Successfully</w:t>
-      </w:r>
-    </w:p>
-    <w:p>
-      <w:pPr>
-        <w:pStyle w:val="ListParagraph"/>
-        <w:numPr>
-          <w:ilvl w:val="0"/>
-          <w:numId w:val="1"/>
-        </w:numPr>
-      </w:pPr>
-      <w:r>
-        <w:t>Book Exchange Successful</w:t>
-      </w:r>
-    </w:p>
-    <w:p>
-      <w:pPr>
-        <w:pStyle w:val="ListParagraph"/>
-        <w:numPr>
-          <w:ilvl w:val="0"/>
-          <w:numId w:val="1"/>
-        </w:numPr>
-      </w:pPr>
-      <w:r>
-        <w:t>Book Not found</w:t>
-      </w:r>
-    </w:p>
-    <w:p>
-      <w:r>
-        <w:t>Notifications Received by Club Members</w:t>
-      </w:r>
-    </w:p>
-    <w:p>
-      <w:pPr>
-        <w:pStyle w:val="ListParagraph"/>
-        <w:numPr>
-          <w:ilvl w:val="0"/>
-          <w:numId w:val="1"/>
-        </w:numPr>
-      </w:pPr>
-      <w:r>
-        <w:t>If I want to request for a book</w:t>
+        <w:t>Your request for [Book Title] has been approved</w:t>
       </w:r>
     </w:p>
     <w:p>
@@ -281,7 +224,7 @@
         </w:numPr>
       </w:pPr>
       <w:r>
-        <w:t>Request sent</w:t>
+        <w:t>Book Dropped at Central Location</w:t>
       </w:r>
     </w:p>
     <w:p>
@@ -293,113 +236,13 @@
         </w:numPr>
       </w:pPr>
       <w:r>
-        <w:t xml:space="preserve">Request Accepted </w:t>
-      </w:r>
-    </w:p>
-    <w:p>
-      <w:pPr>
-        <w:pStyle w:val="ListParagraph"/>
-        <w:numPr>
-          <w:ilvl w:val="2"/>
-          <w:numId w:val="1"/>
-        </w:numPr>
-      </w:pPr>
-      <w:r>
-        <w:t xml:space="preserve">Establish connection via the connect </w:t>
-      </w:r>
-      <w:r>
-        <w:rPr>
-          <w:i/>
-          <w:iCs/>
-        </w:rPr>
-        <w:t>Button</w:t>
-      </w:r>
-      <w:r>
-        <w:rPr>
-          <w:i/>
-          <w:iCs/>
-        </w:rPr>
-        <w:t xml:space="preserve"> </w:t>
-      </w:r>
-      <w:r>
-        <w:rPr>
-          <w:i/>
-          <w:iCs/>
-        </w:rPr>
-        <w:tab/>
-      </w:r>
-    </w:p>
-    <w:p>
-      <w:pPr>
-        <w:pStyle w:val="ListParagraph"/>
-        <w:numPr>
-          <w:ilvl w:val="2"/>
-          <w:numId w:val="1"/>
-        </w:numPr>
-      </w:pPr>
-      <w:r>
-        <w:t xml:space="preserve">The connection will give information about the date and time of availability of the book </w:t>
-      </w:r>
-    </w:p>
-    <w:p>
-      <w:pPr>
-        <w:pStyle w:val="ListParagraph"/>
-        <w:numPr>
-          <w:ilvl w:val="2"/>
-          <w:numId w:val="1"/>
-        </w:numPr>
-      </w:pPr>
-      <w:r>
-        <w:t>If the requester agrees with the parameters, it will click on the “Accept” Button</w:t>
-      </w:r>
-    </w:p>
-    <w:p>
-      <w:pPr>
-        <w:pStyle w:val="ListParagraph"/>
-        <w:numPr>
-          <w:ilvl w:val="3"/>
-          <w:numId w:val="1"/>
-        </w:numPr>
-      </w:pPr>
-      <w:r>
-        <w:t>Book placed at the center</w:t>
-      </w:r>
-    </w:p>
-    <w:p>
-      <w:pPr>
-        <w:pStyle w:val="ListParagraph"/>
-        <w:numPr>
-          <w:ilvl w:val="4"/>
-          <w:numId w:val="1"/>
-        </w:numPr>
-      </w:pPr>
-      <w:r>
-        <w:t>When book found, click on ‘Book received’</w:t>
-      </w:r>
-    </w:p>
-    <w:p>
-      <w:pPr>
-        <w:pStyle w:val="ListParagraph"/>
-        <w:numPr>
-          <w:ilvl w:val="4"/>
-          <w:numId w:val="1"/>
-        </w:numPr>
-      </w:pPr>
-      <w:r>
-        <w:t>If not found , click ‘Book Not found’</w:t>
-      </w:r>
-    </w:p>
-    <w:p>
-      <w:pPr>
-        <w:pStyle w:val="ListParagraph"/>
-        <w:numPr>
-          <w:ilvl w:val="0"/>
-          <w:numId w:val="1"/>
-        </w:numPr>
-      </w:pPr>
-      <w:r>
-        <w:lastRenderedPageBreak/>
-        <w:t xml:space="preserve">If the member holds a particular book </w:t>
+        <w:t xml:space="preserve">The request for [Book name] </w:t>
+      </w:r>
+      <w:r>
+        <w:t>has</w:t>
+      </w:r>
+      <w:r>
+        <w:t xml:space="preserve"> been canceled</w:t>
       </w:r>
     </w:p>
     <w:p>
@@ -411,67 +254,57 @@
         </w:numPr>
       </w:pPr>
       <w:r>
-        <w:t>[Book Name] has been requested</w:t>
-      </w:r>
-    </w:p>
-    <w:p>
-      <w:pPr>
-        <w:pStyle w:val="ListParagraph"/>
-        <w:numPr>
-          <w:ilvl w:val="2"/>
-          <w:numId w:val="1"/>
-        </w:numPr>
-      </w:pPr>
-      <w:r>
-        <w:t>Flow of transaction will take place</w:t>
-      </w:r>
-    </w:p>
-    <w:p>
-      <w:pPr>
-        <w:pStyle w:val="ListParagraph"/>
-        <w:numPr>
-          <w:ilvl w:val="3"/>
-          <w:numId w:val="1"/>
-        </w:numPr>
-      </w:pPr>
-      <w:r>
-        <w:t>Book received successfully</w:t>
-      </w:r>
-    </w:p>
-    <w:p>
-      <w:pPr>
-        <w:pStyle w:val="ListParagraph"/>
-        <w:numPr>
-          <w:ilvl w:val="3"/>
-          <w:numId w:val="1"/>
-        </w:numPr>
-      </w:pPr>
-      <w:r>
-        <w:t>Bok Not found</w:t>
-      </w:r>
-    </w:p>
-    <w:p>
-      <w:pPr>
-        <w:pStyle w:val="ListParagraph"/>
-        <w:numPr>
-          <w:ilvl w:val="0"/>
-          <w:numId w:val="1"/>
-        </w:numPr>
-      </w:pPr>
-      <w:r>
-        <w:t>Review added successfully</w:t>
-      </w:r>
-    </w:p>
-    <w:p>
-      <w:pPr>
-        <w:pStyle w:val="ListParagraph"/>
-        <w:numPr>
-          <w:ilvl w:val="0"/>
-          <w:numId w:val="1"/>
-        </w:numPr>
-      </w:pPr>
-      <w:r>
-        <w:t>Admin:- Re-review</w:t>
+        <w:t xml:space="preserve">The request for [Book name] </w:t>
+      </w:r>
+      <w:r>
+        <w:t>has</w:t>
+      </w:r>
+      <w:r>
+        <w:t xml:space="preserve"> been canceled</w:t>
+      </w:r>
+    </w:p>
+    <w:p>
+      <w:pPr>
+        <w:pStyle w:val="ListParagraph"/>
+      </w:pPr>
+      <w:r>
+        <w:t>If I am the current book holder</w:t>
+      </w:r>
+    </w:p>
+    <w:p>
+      <w:pPr>
+        <w:pStyle w:val="ListParagraph"/>
+        <w:numPr>
+          <w:ilvl w:val="1"/>
+          <w:numId w:val="1"/>
+        </w:numPr>
+      </w:pPr>
+      <w:r>
+        <w:t>A request has been place for [Book name] you have.</w:t>
+      </w:r>
+    </w:p>
+    <w:p>
+      <w:pPr>
+        <w:pStyle w:val="ListParagraph"/>
+        <w:numPr>
+          <w:ilvl w:val="1"/>
+          <w:numId w:val="1"/>
+        </w:numPr>
+      </w:pPr>
+      <w:r>
+        <w:t>The [Book title] has been picked up</w:t>
+      </w:r>
+    </w:p>
+    <w:p>
+      <w:pPr>
+        <w:pStyle w:val="ListParagraph"/>
+        <w:numPr>
+          <w:ilvl w:val="1"/>
+          <w:numId w:val="1"/>
+        </w:numPr>
+      </w:pPr>
+      <w:r>
+        <w:t>Your request for [Book name] have been canceled</w:t>
       </w:r>
     </w:p>
     <w:p>
@@ -494,7 +327,7 @@
   <w:abstractNum w:abstractNumId="0" w15:restartNumberingAfterBreak="0">
     <w:nsid w:val="0DC97C04"/>
     <w:multiLevelType w:val="hybridMultilevel"/>
-    <w:tmpl w:val="2864F44E"/>
+    <w:tmpl w:val="BB08AE2C"/>
     <w:lvl w:ilvl="0" w:tplc="9F32C9DA">
       <w:numFmt w:val="bullet"/>
       <w:lvlText w:val="-"/>
@@ -1212,7 +1045,6 @@
   <w:style w:type="character" w:default="1" w:styleId="DefaultParagraphFont">
     <w:name w:val="Default Paragraph Font"/>
     <w:uiPriority w:val="1"/>
-    <w:semiHidden/>
     <w:unhideWhenUsed/>
   </w:style>
   <w:style w:type="table" w:default="1" w:styleId="TableNormal">

</xml_diff>